<commit_message>
improvement on aml-scans doc and structure
</commit_message>
<xml_diff>
--- a/docs/AML-Scan Tool/BOZZA - Documento di specifica AML-Scan Tool.docx
+++ b/docs/AML-Scan Tool/BOZZA - Documento di specifica AML-Scan Tool.docx
@@ -299,6 +299,7 @@
                                     <w:dataBinding w:prefixMappings="xmlns:ns0='http://purl.org/dc/elements/1.1/' xmlns:ns1='http://schemas.openxmlformats.org/package/2006/metadata/core-properties' " w:xpath="/ns1:coreProperties[1]/ns0:title[1]" w:storeItemID="{6C3C8BC8-F283-45AE-878A-BAB7291924A1}"/>
                                     <w:text/>
                                   </w:sdtPr>
+                                  <w:sdtEndPr/>
                                   <w:sdtContent>
                                     <w:r>
                                       <w:rPr>
@@ -1700,10 +1701,7 @@
         <w:t xml:space="preserve">Si deve predisporre un bottone </w:t>
       </w:r>
       <w:r>
-        <w:t xml:space="preserve">chiamato </w:t>
-      </w:r>
-      <w:r>
-        <w:t>“</w:t>
+        <w:t>chiamato “</w:t>
       </w:r>
       <w:r>
         <w:rPr>
@@ -1941,6 +1939,9 @@
       <w:r>
         <w:t>Sondaggio</w:t>
       </w:r>
+      <w:r>
+        <w:t xml:space="preserve"> (lo deduco da somministrazione)</w:t>
+      </w:r>
     </w:p>
     <w:p>
       <w:pPr>
@@ -1953,6 +1954,9 @@
       <w:r>
         <w:t>ID del modello di verifica</w:t>
       </w:r>
+      <w:r>
+        <w:t xml:space="preserve"> (lo deduco da sondaggio)</w:t>
+      </w:r>
     </w:p>
     <w:p>
       <w:pPr>
@@ -1964,6 +1968,18 @@
       </w:pPr>
       <w:r>
         <w:t>Versione del modello di verifica</w:t>
+      </w:r>
+      <w:r>
+        <w:t xml:space="preserve"> </w:t>
+      </w:r>
+      <w:r>
+        <w:t xml:space="preserve">(lo deduco da </w:t>
+      </w:r>
+      <w:r>
+        <w:t>sondaggio</w:t>
+      </w:r>
+      <w:r>
+        <w:t>)</w:t>
       </w:r>
     </w:p>
     <w:p/>
@@ -3440,7 +3456,7 @@
         <w:t>ere</w:t>
       </w:r>
       <w:r>
-        <w:t xml:space="preserve"> i </w:t>
+        <w:t xml:space="preserve"> </w:t>
       </w:r>
       <w:r>
         <w:t>le entry delle maschere</w:t>
@@ -4413,7 +4429,7 @@
           <w:color w:val="D4D4D4"/>
           <w:sz w:val="21"/>
           <w:szCs w:val="21"/>
-          <w:lang w:eastAsia="it-IT"/>
+          <w:lang w:val="en-GB" w:eastAsia="it-IT"/>
         </w:rPr>
       </w:pPr>
       <w:r>
@@ -4432,7 +4448,7 @@
           <w:color w:val="D4D4D4"/>
           <w:sz w:val="21"/>
           <w:szCs w:val="21"/>
-          <w:lang w:eastAsia="it-IT"/>
+          <w:lang w:val="en-GB" w:eastAsia="it-IT"/>
         </w:rPr>
         <w:t>{</w:t>
       </w:r>
@@ -4446,16 +4462,16 @@
           <w:color w:val="D4D4D4"/>
           <w:sz w:val="21"/>
           <w:szCs w:val="21"/>
-          <w:lang w:eastAsia="it-IT"/>
-        </w:rPr>
-      </w:pPr>
-      <w:r>
-        <w:rPr>
-          <w:rFonts w:ascii="Consolas" w:eastAsia="Times New Roman" w:hAnsi="Consolas" w:cs="Times New Roman"/>
-          <w:color w:val="D4D4D4"/>
-          <w:sz w:val="21"/>
-          <w:szCs w:val="21"/>
-          <w:lang w:eastAsia="it-IT"/>
+          <w:lang w:val="en-GB" w:eastAsia="it-IT"/>
+        </w:rPr>
+      </w:pPr>
+      <w:r>
+        <w:rPr>
+          <w:rFonts w:ascii="Consolas" w:eastAsia="Times New Roman" w:hAnsi="Consolas" w:cs="Times New Roman"/>
+          <w:color w:val="D4D4D4"/>
+          <w:sz w:val="21"/>
+          <w:szCs w:val="21"/>
+          <w:lang w:val="en-GB" w:eastAsia="it-IT"/>
         </w:rPr>
         <w:t xml:space="preserve">        </w:t>
       </w:r>
@@ -4465,7 +4481,7 @@
           <w:color w:val="9CDCFE"/>
           <w:sz w:val="21"/>
           <w:szCs w:val="21"/>
-          <w:lang w:eastAsia="it-IT"/>
+          <w:lang w:val="en-GB" w:eastAsia="it-IT"/>
         </w:rPr>
         <w:t>"entry"</w:t>
       </w:r>
@@ -4475,7 +4491,7 @@
           <w:color w:val="D4D4D4"/>
           <w:sz w:val="21"/>
           <w:szCs w:val="21"/>
-          <w:lang w:eastAsia="it-IT"/>
+          <w:lang w:val="en-GB" w:eastAsia="it-IT"/>
         </w:rPr>
         <w:t xml:space="preserve">: </w:t>
       </w:r>
@@ -4485,17 +4501,39 @@
           <w:color w:val="CE9178"/>
           <w:sz w:val="21"/>
           <w:szCs w:val="21"/>
-          <w:lang w:eastAsia="it-IT"/>
-        </w:rPr>
-        <w:t>"sondaggi"</w:t>
-      </w:r>
-      <w:r>
-        <w:rPr>
-          <w:rFonts w:ascii="Consolas" w:eastAsia="Times New Roman" w:hAnsi="Consolas" w:cs="Times New Roman"/>
-          <w:color w:val="D4D4D4"/>
-          <w:sz w:val="21"/>
-          <w:szCs w:val="21"/>
-          <w:lang w:eastAsia="it-IT"/>
+          <w:lang w:val="en-GB" w:eastAsia="it-IT"/>
+        </w:rPr>
+        <w:t>"</w:t>
+      </w:r>
+      <w:proofErr w:type="spellStart"/>
+      <w:r>
+        <w:rPr>
+          <w:rFonts w:ascii="Consolas" w:eastAsia="Times New Roman" w:hAnsi="Consolas" w:cs="Times New Roman"/>
+          <w:color w:val="CE9178"/>
+          <w:sz w:val="21"/>
+          <w:szCs w:val="21"/>
+          <w:lang w:val="en-GB" w:eastAsia="it-IT"/>
+        </w:rPr>
+        <w:t>sondaggi</w:t>
+      </w:r>
+      <w:proofErr w:type="spellEnd"/>
+      <w:r>
+        <w:rPr>
+          <w:rFonts w:ascii="Consolas" w:eastAsia="Times New Roman" w:hAnsi="Consolas" w:cs="Times New Roman"/>
+          <w:color w:val="CE9178"/>
+          <w:sz w:val="21"/>
+          <w:szCs w:val="21"/>
+          <w:lang w:val="en-GB" w:eastAsia="it-IT"/>
+        </w:rPr>
+        <w:t>"</w:t>
+      </w:r>
+      <w:r>
+        <w:rPr>
+          <w:rFonts w:ascii="Consolas" w:eastAsia="Times New Roman" w:hAnsi="Consolas" w:cs="Times New Roman"/>
+          <w:color w:val="D4D4D4"/>
+          <w:sz w:val="21"/>
+          <w:szCs w:val="21"/>
+          <w:lang w:val="en-GB" w:eastAsia="it-IT"/>
         </w:rPr>
         <w:t>,</w:t>
       </w:r>
@@ -4509,16 +4547,16 @@
           <w:color w:val="D4D4D4"/>
           <w:sz w:val="21"/>
           <w:szCs w:val="21"/>
-          <w:lang w:eastAsia="it-IT"/>
-        </w:rPr>
-      </w:pPr>
-      <w:r>
-        <w:rPr>
-          <w:rFonts w:ascii="Consolas" w:eastAsia="Times New Roman" w:hAnsi="Consolas" w:cs="Times New Roman"/>
-          <w:color w:val="D4D4D4"/>
-          <w:sz w:val="21"/>
-          <w:szCs w:val="21"/>
-          <w:lang w:eastAsia="it-IT"/>
+          <w:lang w:val="en-GB" w:eastAsia="it-IT"/>
+        </w:rPr>
+      </w:pPr>
+      <w:r>
+        <w:rPr>
+          <w:rFonts w:ascii="Consolas" w:eastAsia="Times New Roman" w:hAnsi="Consolas" w:cs="Times New Roman"/>
+          <w:color w:val="D4D4D4"/>
+          <w:sz w:val="21"/>
+          <w:szCs w:val="21"/>
+          <w:lang w:val="en-GB" w:eastAsia="it-IT"/>
         </w:rPr>
         <w:t xml:space="preserve">        </w:t>
       </w:r>
@@ -4528,7 +4566,7 @@
           <w:color w:val="9CDCFE"/>
           <w:sz w:val="21"/>
           <w:szCs w:val="21"/>
-          <w:lang w:eastAsia="it-IT"/>
+          <w:lang w:val="en-GB" w:eastAsia="it-IT"/>
         </w:rPr>
         <w:t>"source"</w:t>
       </w:r>
@@ -4538,7 +4576,7 @@
           <w:color w:val="D4D4D4"/>
           <w:sz w:val="21"/>
           <w:szCs w:val="21"/>
-          <w:lang w:eastAsia="it-IT"/>
+          <w:lang w:val="en-GB" w:eastAsia="it-IT"/>
         </w:rPr>
         <w:t xml:space="preserve">: </w:t>
       </w:r>
@@ -4548,7 +4586,7 @@
           <w:color w:val="CE9178"/>
           <w:sz w:val="21"/>
           <w:szCs w:val="21"/>
-          <w:lang w:eastAsia="it-IT"/>
+          <w:lang w:val="en-GB" w:eastAsia="it-IT"/>
         </w:rPr>
         <w:t>"</w:t>
       </w:r>
@@ -4559,7 +4597,7 @@
           <w:color w:val="CE9178"/>
           <w:sz w:val="21"/>
           <w:szCs w:val="21"/>
-          <w:lang w:eastAsia="it-IT"/>
+          <w:lang w:val="en-GB" w:eastAsia="it-IT"/>
         </w:rPr>
         <w:t>kyctech</w:t>
       </w:r>
@@ -4570,7 +4608,7 @@
           <w:color w:val="CE9178"/>
           <w:sz w:val="21"/>
           <w:szCs w:val="21"/>
-          <w:lang w:eastAsia="it-IT"/>
+          <w:lang w:val="en-GB" w:eastAsia="it-IT"/>
         </w:rPr>
         <w:t>"</w:t>
       </w:r>
@@ -4584,16 +4622,16 @@
           <w:color w:val="D4D4D4"/>
           <w:sz w:val="21"/>
           <w:szCs w:val="21"/>
-          <w:lang w:eastAsia="it-IT"/>
-        </w:rPr>
-      </w:pPr>
-      <w:r>
-        <w:rPr>
-          <w:rFonts w:ascii="Consolas" w:eastAsia="Times New Roman" w:hAnsi="Consolas" w:cs="Times New Roman"/>
-          <w:color w:val="D4D4D4"/>
-          <w:sz w:val="21"/>
-          <w:szCs w:val="21"/>
-          <w:lang w:eastAsia="it-IT"/>
+          <w:lang w:val="en-GB" w:eastAsia="it-IT"/>
+        </w:rPr>
+      </w:pPr>
+      <w:r>
+        <w:rPr>
+          <w:rFonts w:ascii="Consolas" w:eastAsia="Times New Roman" w:hAnsi="Consolas" w:cs="Times New Roman"/>
+          <w:color w:val="D4D4D4"/>
+          <w:sz w:val="21"/>
+          <w:szCs w:val="21"/>
+          <w:lang w:val="en-GB" w:eastAsia="it-IT"/>
         </w:rPr>
         <w:t>      },</w:t>
       </w:r>
@@ -4607,16 +4645,16 @@
           <w:color w:val="D4D4D4"/>
           <w:sz w:val="21"/>
           <w:szCs w:val="21"/>
-          <w:lang w:eastAsia="it-IT"/>
-        </w:rPr>
-      </w:pPr>
-      <w:r>
-        <w:rPr>
-          <w:rFonts w:ascii="Consolas" w:eastAsia="Times New Roman" w:hAnsi="Consolas" w:cs="Times New Roman"/>
-          <w:color w:val="D4D4D4"/>
-          <w:sz w:val="21"/>
-          <w:szCs w:val="21"/>
-          <w:lang w:eastAsia="it-IT"/>
+          <w:lang w:val="en-GB" w:eastAsia="it-IT"/>
+        </w:rPr>
+      </w:pPr>
+      <w:r>
+        <w:rPr>
+          <w:rFonts w:ascii="Consolas" w:eastAsia="Times New Roman" w:hAnsi="Consolas" w:cs="Times New Roman"/>
+          <w:color w:val="D4D4D4"/>
+          <w:sz w:val="21"/>
+          <w:szCs w:val="21"/>
+          <w:lang w:val="en-GB" w:eastAsia="it-IT"/>
         </w:rPr>
         <w:t>      {</w:t>
       </w:r>
@@ -4630,16 +4668,16 @@
           <w:color w:val="D4D4D4"/>
           <w:sz w:val="21"/>
           <w:szCs w:val="21"/>
-          <w:lang w:eastAsia="it-IT"/>
-        </w:rPr>
-      </w:pPr>
-      <w:r>
-        <w:rPr>
-          <w:rFonts w:ascii="Consolas" w:eastAsia="Times New Roman" w:hAnsi="Consolas" w:cs="Times New Roman"/>
-          <w:color w:val="D4D4D4"/>
-          <w:sz w:val="21"/>
-          <w:szCs w:val="21"/>
-          <w:lang w:eastAsia="it-IT"/>
+          <w:lang w:val="en-GB" w:eastAsia="it-IT"/>
+        </w:rPr>
+      </w:pPr>
+      <w:r>
+        <w:rPr>
+          <w:rFonts w:ascii="Consolas" w:eastAsia="Times New Roman" w:hAnsi="Consolas" w:cs="Times New Roman"/>
+          <w:color w:val="D4D4D4"/>
+          <w:sz w:val="21"/>
+          <w:szCs w:val="21"/>
+          <w:lang w:val="en-GB" w:eastAsia="it-IT"/>
         </w:rPr>
         <w:t xml:space="preserve">        </w:t>
       </w:r>
@@ -4649,7 +4687,7 @@
           <w:color w:val="9CDCFE"/>
           <w:sz w:val="21"/>
           <w:szCs w:val="21"/>
-          <w:lang w:eastAsia="it-IT"/>
+          <w:lang w:val="en-GB" w:eastAsia="it-IT"/>
         </w:rPr>
         <w:t>"entry"</w:t>
       </w:r>
@@ -4659,7 +4697,7 @@
           <w:color w:val="D4D4D4"/>
           <w:sz w:val="21"/>
           <w:szCs w:val="21"/>
-          <w:lang w:eastAsia="it-IT"/>
+          <w:lang w:val="en-GB" w:eastAsia="it-IT"/>
         </w:rPr>
         <w:t xml:space="preserve">: </w:t>
       </w:r>
@@ -4669,7 +4707,7 @@
           <w:color w:val="CE9178"/>
           <w:sz w:val="21"/>
           <w:szCs w:val="21"/>
-          <w:lang w:eastAsia="it-IT"/>
+          <w:lang w:val="en-GB" w:eastAsia="it-IT"/>
         </w:rPr>
         <w:t>"</w:t>
       </w:r>
@@ -4680,7 +4718,7 @@
           <w:color w:val="CE9178"/>
           <w:sz w:val="21"/>
           <w:szCs w:val="21"/>
-          <w:lang w:eastAsia="it-IT"/>
+          <w:lang w:val="en-GB" w:eastAsia="it-IT"/>
         </w:rPr>
         <w:t>sondaggi_somministrati</w:t>
       </w:r>
@@ -4691,7 +4729,7 @@
           <w:color w:val="CE9178"/>
           <w:sz w:val="21"/>
           <w:szCs w:val="21"/>
-          <w:lang w:eastAsia="it-IT"/>
+          <w:lang w:val="en-GB" w:eastAsia="it-IT"/>
         </w:rPr>
         <w:t>"</w:t>
       </w:r>
@@ -4701,7 +4739,7 @@
           <w:color w:val="D4D4D4"/>
           <w:sz w:val="21"/>
           <w:szCs w:val="21"/>
-          <w:lang w:eastAsia="it-IT"/>
+          <w:lang w:val="en-GB" w:eastAsia="it-IT"/>
         </w:rPr>
         <w:t>,</w:t>
       </w:r>
@@ -4724,7 +4762,7 @@
           <w:color w:val="D4D4D4"/>
           <w:sz w:val="21"/>
           <w:szCs w:val="21"/>
-          <w:lang w:eastAsia="it-IT"/>
+          <w:lang w:val="en-GB" w:eastAsia="it-IT"/>
         </w:rPr>
         <w:t xml:space="preserve">        </w:t>
       </w:r>
@@ -4790,18 +4828,28 @@
           <w:color w:val="D4D4D4"/>
           <w:sz w:val="21"/>
           <w:szCs w:val="21"/>
-          <w:lang w:val="en-GB" w:eastAsia="it-IT"/>
-        </w:rPr>
-      </w:pPr>
-      <w:r>
-        <w:rPr>
-          <w:rFonts w:ascii="Consolas" w:eastAsia="Times New Roman" w:hAnsi="Consolas" w:cs="Times New Roman"/>
-          <w:color w:val="D4D4D4"/>
-          <w:sz w:val="21"/>
-          <w:szCs w:val="21"/>
-          <w:lang w:val="en-GB" w:eastAsia="it-IT"/>
-        </w:rPr>
-        <w:t>      },</w:t>
+          <w:lang w:eastAsia="it-IT"/>
+        </w:rPr>
+      </w:pPr>
+      <w:r>
+        <w:rPr>
+          <w:rFonts w:ascii="Consolas" w:eastAsia="Times New Roman" w:hAnsi="Consolas" w:cs="Times New Roman"/>
+          <w:color w:val="D4D4D4"/>
+          <w:sz w:val="21"/>
+          <w:szCs w:val="21"/>
+          <w:lang w:val="en-GB" w:eastAsia="it-IT"/>
+        </w:rPr>
+        <w:t xml:space="preserve">      </w:t>
+      </w:r>
+      <w:r>
+        <w:rPr>
+          <w:rFonts w:ascii="Consolas" w:eastAsia="Times New Roman" w:hAnsi="Consolas" w:cs="Times New Roman"/>
+          <w:color w:val="D4D4D4"/>
+          <w:sz w:val="21"/>
+          <w:szCs w:val="21"/>
+          <w:lang w:eastAsia="it-IT"/>
+        </w:rPr>
+        <w:t>},</w:t>
       </w:r>
     </w:p>
     <w:p>
@@ -4813,16 +4861,16 @@
           <w:color w:val="D4D4D4"/>
           <w:sz w:val="21"/>
           <w:szCs w:val="21"/>
-          <w:lang w:val="en-GB" w:eastAsia="it-IT"/>
-        </w:rPr>
-      </w:pPr>
-      <w:r>
-        <w:rPr>
-          <w:rFonts w:ascii="Consolas" w:eastAsia="Times New Roman" w:hAnsi="Consolas" w:cs="Times New Roman"/>
-          <w:color w:val="D4D4D4"/>
-          <w:sz w:val="21"/>
-          <w:szCs w:val="21"/>
-          <w:lang w:val="en-GB" w:eastAsia="it-IT"/>
+          <w:lang w:eastAsia="it-IT"/>
+        </w:rPr>
+      </w:pPr>
+      <w:r>
+        <w:rPr>
+          <w:rFonts w:ascii="Consolas" w:eastAsia="Times New Roman" w:hAnsi="Consolas" w:cs="Times New Roman"/>
+          <w:color w:val="D4D4D4"/>
+          <w:sz w:val="21"/>
+          <w:szCs w:val="21"/>
+          <w:lang w:eastAsia="it-IT"/>
         </w:rPr>
         <w:t>      {</w:t>
       </w:r>
@@ -4836,16 +4884,16 @@
           <w:color w:val="D4D4D4"/>
           <w:sz w:val="21"/>
           <w:szCs w:val="21"/>
-          <w:lang w:val="en-GB" w:eastAsia="it-IT"/>
-        </w:rPr>
-      </w:pPr>
-      <w:r>
-        <w:rPr>
-          <w:rFonts w:ascii="Consolas" w:eastAsia="Times New Roman" w:hAnsi="Consolas" w:cs="Times New Roman"/>
-          <w:color w:val="D4D4D4"/>
-          <w:sz w:val="21"/>
-          <w:szCs w:val="21"/>
-          <w:lang w:val="en-GB" w:eastAsia="it-IT"/>
+          <w:lang w:eastAsia="it-IT"/>
+        </w:rPr>
+      </w:pPr>
+      <w:r>
+        <w:rPr>
+          <w:rFonts w:ascii="Consolas" w:eastAsia="Times New Roman" w:hAnsi="Consolas" w:cs="Times New Roman"/>
+          <w:color w:val="D4D4D4"/>
+          <w:sz w:val="21"/>
+          <w:szCs w:val="21"/>
+          <w:lang w:eastAsia="it-IT"/>
         </w:rPr>
         <w:t xml:space="preserve">        </w:t>
       </w:r>
@@ -4855,7 +4903,7 @@
           <w:color w:val="9CDCFE"/>
           <w:sz w:val="21"/>
           <w:szCs w:val="21"/>
-          <w:lang w:val="en-GB" w:eastAsia="it-IT"/>
+          <w:lang w:eastAsia="it-IT"/>
         </w:rPr>
         <w:t>"entry"</w:t>
       </w:r>
@@ -4865,7 +4913,7 @@
           <w:color w:val="D4D4D4"/>
           <w:sz w:val="21"/>
           <w:szCs w:val="21"/>
-          <w:lang w:val="en-GB" w:eastAsia="it-IT"/>
+          <w:lang w:eastAsia="it-IT"/>
         </w:rPr>
         <w:t xml:space="preserve">: </w:t>
       </w:r>
@@ -4875,7 +4923,7 @@
           <w:color w:val="CE9178"/>
           <w:sz w:val="21"/>
           <w:szCs w:val="21"/>
-          <w:lang w:val="en-GB" w:eastAsia="it-IT"/>
+          <w:lang w:eastAsia="it-IT"/>
         </w:rPr>
         <w:t>"</w:t>
       </w:r>
@@ -4886,7 +4934,7 @@
           <w:color w:val="CE9178"/>
           <w:sz w:val="21"/>
           <w:szCs w:val="21"/>
-          <w:lang w:val="en-GB" w:eastAsia="it-IT"/>
+          <w:lang w:eastAsia="it-IT"/>
         </w:rPr>
         <w:t>domande_sezioni_sub_of_somministrazioni</w:t>
       </w:r>
@@ -4897,7 +4945,7 @@
           <w:color w:val="CE9178"/>
           <w:sz w:val="21"/>
           <w:szCs w:val="21"/>
-          <w:lang w:val="en-GB" w:eastAsia="it-IT"/>
+          <w:lang w:eastAsia="it-IT"/>
         </w:rPr>
         <w:t>"</w:t>
       </w:r>
@@ -4907,7 +4955,7 @@
           <w:color w:val="D4D4D4"/>
           <w:sz w:val="21"/>
           <w:szCs w:val="21"/>
-          <w:lang w:val="en-GB" w:eastAsia="it-IT"/>
+          <w:lang w:eastAsia="it-IT"/>
         </w:rPr>
         <w:t>,</w:t>
       </w:r>
@@ -4930,7 +4978,7 @@
           <w:color w:val="D4D4D4"/>
           <w:sz w:val="21"/>
           <w:szCs w:val="21"/>
-          <w:lang w:val="en-GB" w:eastAsia="it-IT"/>
+          <w:lang w:eastAsia="it-IT"/>
         </w:rPr>
         <w:t xml:space="preserve">        </w:t>
       </w:r>
@@ -10080,18 +10128,28 @@
           <w:color w:val="D4D4D4"/>
           <w:sz w:val="21"/>
           <w:szCs w:val="21"/>
-          <w:lang w:val="en-GB" w:eastAsia="it-IT"/>
-        </w:rPr>
-      </w:pPr>
-      <w:r>
-        <w:rPr>
-          <w:rFonts w:ascii="Consolas" w:eastAsia="Times New Roman" w:hAnsi="Consolas" w:cs="Times New Roman"/>
-          <w:color w:val="D4D4D4"/>
-          <w:sz w:val="21"/>
-          <w:szCs w:val="21"/>
-          <w:lang w:val="en-GB" w:eastAsia="it-IT"/>
-        </w:rPr>
-        <w:t>        }</w:t>
+          <w:lang w:eastAsia="it-IT"/>
+        </w:rPr>
+      </w:pPr>
+      <w:r>
+        <w:rPr>
+          <w:rFonts w:ascii="Consolas" w:eastAsia="Times New Roman" w:hAnsi="Consolas" w:cs="Times New Roman"/>
+          <w:color w:val="D4D4D4"/>
+          <w:sz w:val="21"/>
+          <w:szCs w:val="21"/>
+          <w:lang w:val="en-GB" w:eastAsia="it-IT"/>
+        </w:rPr>
+        <w:t xml:space="preserve">        </w:t>
+      </w:r>
+      <w:r>
+        <w:rPr>
+          <w:rFonts w:ascii="Consolas" w:eastAsia="Times New Roman" w:hAnsi="Consolas" w:cs="Times New Roman"/>
+          <w:color w:val="D4D4D4"/>
+          <w:sz w:val="21"/>
+          <w:szCs w:val="21"/>
+          <w:lang w:eastAsia="it-IT"/>
+        </w:rPr>
+        <w:t>}</w:t>
       </w:r>
     </w:p>
     <w:p>
@@ -10103,16 +10161,16 @@
           <w:color w:val="D4D4D4"/>
           <w:sz w:val="21"/>
           <w:szCs w:val="21"/>
-          <w:lang w:val="en-GB" w:eastAsia="it-IT"/>
-        </w:rPr>
-      </w:pPr>
-      <w:r>
-        <w:rPr>
-          <w:rFonts w:ascii="Consolas" w:eastAsia="Times New Roman" w:hAnsi="Consolas" w:cs="Times New Roman"/>
-          <w:color w:val="D4D4D4"/>
-          <w:sz w:val="21"/>
-          <w:szCs w:val="21"/>
-          <w:lang w:val="en-GB" w:eastAsia="it-IT"/>
+          <w:lang w:eastAsia="it-IT"/>
+        </w:rPr>
+      </w:pPr>
+      <w:r>
+        <w:rPr>
+          <w:rFonts w:ascii="Consolas" w:eastAsia="Times New Roman" w:hAnsi="Consolas" w:cs="Times New Roman"/>
+          <w:color w:val="D4D4D4"/>
+          <w:sz w:val="21"/>
+          <w:szCs w:val="21"/>
+          <w:lang w:eastAsia="it-IT"/>
         </w:rPr>
         <w:t>      ));</w:t>
       </w:r>
@@ -10126,16 +10184,16 @@
           <w:color w:val="D4D4D4"/>
           <w:sz w:val="21"/>
           <w:szCs w:val="21"/>
-          <w:lang w:val="en-GB" w:eastAsia="it-IT"/>
-        </w:rPr>
-      </w:pPr>
-      <w:r>
-        <w:rPr>
-          <w:rFonts w:ascii="Consolas" w:eastAsia="Times New Roman" w:hAnsi="Consolas" w:cs="Times New Roman"/>
-          <w:color w:val="D4D4D4"/>
-          <w:sz w:val="21"/>
-          <w:szCs w:val="21"/>
-          <w:lang w:val="en-GB" w:eastAsia="it-IT"/>
+          <w:lang w:eastAsia="it-IT"/>
+        </w:rPr>
+      </w:pPr>
+      <w:r>
+        <w:rPr>
+          <w:rFonts w:ascii="Consolas" w:eastAsia="Times New Roman" w:hAnsi="Consolas" w:cs="Times New Roman"/>
+          <w:color w:val="D4D4D4"/>
+          <w:sz w:val="21"/>
+          <w:szCs w:val="21"/>
+          <w:lang w:eastAsia="it-IT"/>
         </w:rPr>
         <w:t>    }</w:t>
       </w:r>
@@ -10149,54 +10207,35 @@
           <w:color w:val="D4D4D4"/>
           <w:sz w:val="21"/>
           <w:szCs w:val="21"/>
-          <w:lang w:val="en-GB" w:eastAsia="it-IT"/>
-        </w:rPr>
-      </w:pPr>
-      <w:r>
-        <w:rPr>
-          <w:rFonts w:ascii="Consolas" w:eastAsia="Times New Roman" w:hAnsi="Consolas" w:cs="Times New Roman"/>
-          <w:color w:val="D4D4D4"/>
-          <w:sz w:val="21"/>
-          <w:szCs w:val="21"/>
-          <w:lang w:val="en-GB" w:eastAsia="it-IT"/>
+          <w:lang w:eastAsia="it-IT"/>
+        </w:rPr>
+      </w:pPr>
+      <w:r>
+        <w:rPr>
+          <w:rFonts w:ascii="Consolas" w:eastAsia="Times New Roman" w:hAnsi="Consolas" w:cs="Times New Roman"/>
+          <w:color w:val="D4D4D4"/>
+          <w:sz w:val="21"/>
+          <w:szCs w:val="21"/>
+          <w:lang w:eastAsia="it-IT"/>
         </w:rPr>
         <w:t>  }</w:t>
       </w:r>
     </w:p>
-    <w:p>
-      <w:pPr>
-        <w:rPr>
-          <w:lang w:val="en-GB"/>
-        </w:rPr>
-      </w:pPr>
-    </w:p>
-    <w:p>
-      <w:pPr>
-        <w:rPr>
-          <w:lang w:val="en-GB"/>
-        </w:rPr>
-      </w:pPr>
-    </w:p>
-    <w:p>
-      <w:pPr>
-        <w:rPr>
-          <w:lang w:val="en-GB"/>
-        </w:rPr>
-      </w:pPr>
-    </w:p>
+    <w:p/>
+    <w:p/>
+    <w:p/>
     <w:p>
       <w:pPr>
         <w:pStyle w:val="Titolo2"/>
-        <w:rPr>
-          <w:lang w:val="en-GB"/>
-        </w:rPr>
-      </w:pPr>
-      <w:r>
-        <w:rPr>
-          <w:lang w:val="en-GB"/>
-        </w:rPr>
-        <w:t>DB PostgreSQL</w:t>
-      </w:r>
+      </w:pPr>
+      <w:r>
+        <w:t xml:space="preserve">DB </w:t>
+      </w:r>
+      <w:proofErr w:type="spellStart"/>
+      <w:r>
+        <w:t>PostgreSQL</w:t>
+      </w:r>
+      <w:proofErr w:type="spellEnd"/>
     </w:p>
     <w:p>
       <w:r>
@@ -10413,158 +10452,62 @@
     <w:p>
       <w:pPr>
         <w:pStyle w:val="Titolo1"/>
-        <w:rPr>
-          <w:lang w:val="en-GB"/>
-        </w:rPr>
-      </w:pPr>
-      <w:r>
-        <w:rPr>
-          <w:lang w:val="en-GB"/>
-        </w:rPr>
+      </w:pPr>
+      <w:r>
         <w:t>RIFERIMENTI UTILI</w:t>
       </w:r>
     </w:p>
-    <w:p>
-      <w:pPr>
-        <w:rPr>
-          <w:lang w:val="en-GB"/>
-        </w:rPr>
-      </w:pPr>
-    </w:p>
-    <w:p>
-      <w:pPr>
-        <w:rPr>
-          <w:lang w:val="en-GB"/>
-        </w:rPr>
-      </w:pPr>
-      <w:r>
-        <w:rPr>
-          <w:lang w:val="en-GB"/>
-        </w:rPr>
+    <w:p/>
+    <w:p>
+      <w:r>
         <w:t xml:space="preserve">Yves </w:t>
       </w:r>
       <w:proofErr w:type="spellStart"/>
       <w:r>
-        <w:rPr>
-          <w:lang w:val="en-GB"/>
-        </w:rPr>
         <w:t>Glodt</w:t>
       </w:r>
       <w:proofErr w:type="spellEnd"/>
       <w:r>
-        <w:rPr>
-          <w:lang w:val="en-GB"/>
-        </w:rPr>
         <w:t xml:space="preserve"> (Senior IT): +352 661 45 83 06, </w:t>
       </w:r>
       <w:hyperlink r:id="rId12" w:history="1">
         <w:r>
           <w:rPr>
             <w:rStyle w:val="Collegamentoipertestuale"/>
-            <w:lang w:val="en-GB"/>
           </w:rPr>
           <w:t>yves.glodt@maqit.lu</w:t>
         </w:r>
       </w:hyperlink>
     </w:p>
     <w:p>
-      <w:pPr>
-        <w:rPr>
-          <w:lang w:val="en-GB"/>
-        </w:rPr>
-      </w:pPr>
-      <w:r>
-        <w:rPr>
-          <w:lang w:val="en-GB"/>
-        </w:rPr>
+      <w:r>
         <w:t xml:space="preserve">Thierry </w:t>
       </w:r>
       <w:proofErr w:type="spellStart"/>
       <w:r>
-        <w:rPr>
-          <w:lang w:val="en-GB"/>
-        </w:rPr>
-        <w:t>An</w:t>
-      </w:r>
-      <w:r>
-        <w:rPr>
-          <w:lang w:val="en-GB"/>
-        </w:rPr>
-        <w:t>drè</w:t>
+        <w:t>Andrè</w:t>
       </w:r>
       <w:proofErr w:type="spellEnd"/>
       <w:r>
-        <w:rPr>
-          <w:lang w:val="en-GB"/>
-        </w:rPr>
         <w:t xml:space="preserve"> (Partner): +352 691 505 110, </w:t>
       </w:r>
       <w:hyperlink r:id="rId13" w:history="1">
         <w:r>
           <w:rPr>
             <w:rStyle w:val="Collegamentoipertestuale"/>
-            <w:lang w:val="en-GB"/>
           </w:rPr>
           <w:t>thierry.andre@maqit.lu</w:t>
         </w:r>
       </w:hyperlink>
     </w:p>
-    <w:p>
-      <w:pPr>
-        <w:rPr>
-          <w:lang w:val="en-GB"/>
-        </w:rPr>
-      </w:pPr>
-    </w:p>
-    <w:p>
-      <w:pPr>
-        <w:rPr>
-          <w:lang w:val="en-GB"/>
-        </w:rPr>
-      </w:pPr>
-    </w:p>
-    <w:p>
-      <w:pPr>
-        <w:rPr>
-          <w:lang w:val="en-GB"/>
-        </w:rPr>
-      </w:pPr>
-    </w:p>
-    <w:p>
-      <w:pPr>
-        <w:rPr>
-          <w:lang w:val="en-GB"/>
-        </w:rPr>
-      </w:pPr>
-    </w:p>
-    <w:p>
-      <w:pPr>
-        <w:rPr>
-          <w:lang w:val="en-GB"/>
-        </w:rPr>
-      </w:pPr>
-    </w:p>
-    <w:p>
-      <w:pPr>
-        <w:rPr>
-          <w:lang w:val="en-GB"/>
-        </w:rPr>
-      </w:pPr>
-    </w:p>
-    <w:p>
-      <w:pPr>
-        <w:rPr>
-          <w:lang w:val="en-GB"/>
-        </w:rPr>
-      </w:pPr>
-    </w:p>
-    <w:p>
-      <w:pPr>
-        <w:rPr>
-          <w:lang w:val="en-GB"/>
-        </w:rPr>
-      </w:pPr>
-    </w:p>
+    <w:p/>
+    <w:p/>
+    <w:p/>
+    <w:p/>
+    <w:p/>
+    <w:p/>
+    <w:p/>
+    <w:p/>
     <w:p>
       <w:pPr>
         <w:ind w:firstLine="708"/>
@@ -10735,6 +10678,7 @@
         <w:dataBinding w:prefixMappings="xmlns:ns0='http://purl.org/dc/elements/1.1/' xmlns:ns1='http://schemas.openxmlformats.org/package/2006/metadata/core-properties' " w:xpath="/ns1:coreProperties[1]/ns0:title[1]" w:storeItemID="{6C3C8BC8-F283-45AE-878A-BAB7291924A1}"/>
         <w:text/>
       </w:sdtPr>
+      <w:sdtEndPr/>
       <w:sdtContent>
         <w:r>
           <w:rPr>
@@ -14385,6 +14329,7 @@
   <w:style w:type="character" w:default="1" w:styleId="Carpredefinitoparagrafo">
     <w:name w:val="Default Paragraph Font"/>
     <w:uiPriority w:val="1"/>
+    <w:semiHidden/>
     <w:unhideWhenUsed/>
   </w:style>
   <w:style w:type="table" w:default="1" w:styleId="Tabellanormale">

</xml_diff>